<commit_message>
cap nhat cau1.docx tra loi cau 5
</commit_message>
<xml_diff>
--- a/cau1.docx
+++ b/cau1.docx
@@ -10,45 +10,8 @@
           <w:numId w:val="1"/>
         </w:numPr>
       </w:pPr>
-      <w:proofErr w:type="spellStart"/>
-      <w:r>
-        <w:t>Xung</w:t>
-      </w:r>
-      <w:proofErr w:type="spellEnd"/>
-      <w:r>
-        <w:t xml:space="preserve"> </w:t>
-      </w:r>
-      <w:proofErr w:type="spellStart"/>
-      <w:r>
-        <w:t>đột</w:t>
-      </w:r>
-      <w:proofErr w:type="spellEnd"/>
-      <w:r>
-        <w:t xml:space="preserve"> </w:t>
-      </w:r>
-      <w:proofErr w:type="spellStart"/>
-      <w:r>
-        <w:t>trong</w:t>
-      </w:r>
-      <w:proofErr w:type="spellEnd"/>
-      <w:r>
-        <w:t xml:space="preserve"> git </w:t>
-      </w:r>
-      <w:proofErr w:type="spellStart"/>
-      <w:r>
-        <w:t>là</w:t>
-      </w:r>
-      <w:proofErr w:type="spellEnd"/>
-      <w:r>
-        <w:t xml:space="preserve"> </w:t>
-      </w:r>
-      <w:proofErr w:type="spellStart"/>
-      <w:r>
-        <w:t>gì</w:t>
-      </w:r>
-      <w:proofErr w:type="spellEnd"/>
-      <w:r>
-        <w:t>:</w:t>
+      <w:r>
+        <w:t>Xung đột trong git là gì:</w:t>
       </w:r>
     </w:p>
     <w:p>
@@ -59,245 +22,8 @@
           <w:numId w:val="2"/>
         </w:numPr>
       </w:pPr>
-      <w:proofErr w:type="spellStart"/>
-      <w:r>
-        <w:t>Là</w:t>
-      </w:r>
-      <w:proofErr w:type="spellEnd"/>
-      <w:r>
-        <w:t xml:space="preserve"> </w:t>
-      </w:r>
-      <w:proofErr w:type="spellStart"/>
-      <w:r>
-        <w:t>sự</w:t>
-      </w:r>
-      <w:proofErr w:type="spellEnd"/>
-      <w:r>
-        <w:t xml:space="preserve"> </w:t>
-      </w:r>
-      <w:proofErr w:type="spellStart"/>
-      <w:r>
-        <w:t>không</w:t>
-      </w:r>
-      <w:proofErr w:type="spellEnd"/>
-      <w:r>
-        <w:t xml:space="preserve"> </w:t>
-      </w:r>
-      <w:proofErr w:type="spellStart"/>
-      <w:r>
-        <w:t>đồng</w:t>
-      </w:r>
-      <w:proofErr w:type="spellEnd"/>
-      <w:r>
-        <w:t xml:space="preserve"> </w:t>
-      </w:r>
-      <w:proofErr w:type="spellStart"/>
-      <w:r>
-        <w:t>bộ</w:t>
-      </w:r>
-      <w:proofErr w:type="spellEnd"/>
-      <w:r>
-        <w:t xml:space="preserve"> </w:t>
-      </w:r>
-      <w:proofErr w:type="spellStart"/>
-      <w:r>
-        <w:t>của</w:t>
-      </w:r>
-      <w:proofErr w:type="spellEnd"/>
-      <w:r>
-        <w:t xml:space="preserve"> </w:t>
-      </w:r>
-      <w:proofErr w:type="spellStart"/>
-      <w:r>
-        <w:t>các</w:t>
-      </w:r>
-      <w:proofErr w:type="spellEnd"/>
-      <w:r>
-        <w:t xml:space="preserve"> </w:t>
-      </w:r>
-      <w:proofErr w:type="spellStart"/>
-      <w:r>
-        <w:t>dữ</w:t>
-      </w:r>
-      <w:proofErr w:type="spellEnd"/>
-      <w:r>
-        <w:t xml:space="preserve"> </w:t>
-      </w:r>
-      <w:proofErr w:type="spellStart"/>
-      <w:r>
-        <w:t>liệu</w:t>
-      </w:r>
-      <w:proofErr w:type="spellEnd"/>
-      <w:r>
-        <w:t xml:space="preserve"> </w:t>
-      </w:r>
-      <w:proofErr w:type="spellStart"/>
-      <w:r>
-        <w:t>được</w:t>
-      </w:r>
-      <w:proofErr w:type="spellEnd"/>
-      <w:r>
-        <w:t xml:space="preserve"> git </w:t>
-      </w:r>
-      <w:proofErr w:type="spellStart"/>
-      <w:r>
-        <w:t>quản</w:t>
-      </w:r>
-      <w:proofErr w:type="spellEnd"/>
-      <w:r>
-        <w:t xml:space="preserve"> </w:t>
-      </w:r>
-      <w:proofErr w:type="spellStart"/>
-      <w:r>
-        <w:t>lý</w:t>
-      </w:r>
-      <w:proofErr w:type="spellEnd"/>
-      <w:r>
-        <w:t xml:space="preserve"> </w:t>
-      </w:r>
-      <w:proofErr w:type="spellStart"/>
-      <w:r>
-        <w:t>và</w:t>
-      </w:r>
-      <w:proofErr w:type="spellEnd"/>
-      <w:r>
-        <w:t xml:space="preserve"> </w:t>
-      </w:r>
-      <w:proofErr w:type="spellStart"/>
-      <w:r>
-        <w:t>lưu</w:t>
-      </w:r>
-      <w:proofErr w:type="spellEnd"/>
-      <w:r>
-        <w:t xml:space="preserve"> </w:t>
-      </w:r>
-      <w:proofErr w:type="spellStart"/>
-      <w:r>
-        <w:t>trữ</w:t>
-      </w:r>
-      <w:proofErr w:type="spellEnd"/>
-      <w:r>
-        <w:t xml:space="preserve">. Các </w:t>
-      </w:r>
-      <w:proofErr w:type="spellStart"/>
-      <w:r>
-        <w:t>dữ</w:t>
-      </w:r>
-      <w:proofErr w:type="spellEnd"/>
-      <w:r>
-        <w:t xml:space="preserve"> </w:t>
-      </w:r>
-      <w:proofErr w:type="spellStart"/>
-      <w:r>
-        <w:t>liệu</w:t>
-      </w:r>
-      <w:proofErr w:type="spellEnd"/>
-      <w:r>
-        <w:t xml:space="preserve"> </w:t>
-      </w:r>
-      <w:proofErr w:type="spellStart"/>
-      <w:r>
-        <w:t>của</w:t>
-      </w:r>
-      <w:proofErr w:type="spellEnd"/>
-      <w:r>
-        <w:t xml:space="preserve"> 1 file, </w:t>
-      </w:r>
-      <w:proofErr w:type="spellStart"/>
-      <w:r>
-        <w:t>thư</w:t>
-      </w:r>
-      <w:proofErr w:type="spellEnd"/>
-      <w:r>
-        <w:t xml:space="preserve"> </w:t>
-      </w:r>
-      <w:proofErr w:type="spellStart"/>
-      <w:r>
-        <w:t>mục</w:t>
-      </w:r>
-      <w:proofErr w:type="spellEnd"/>
-      <w:r>
-        <w:t>,..</w:t>
-      </w:r>
-      <w:proofErr w:type="spellStart"/>
-      <w:r>
-        <w:t>có</w:t>
-      </w:r>
-      <w:proofErr w:type="spellEnd"/>
-      <w:r>
-        <w:t xml:space="preserve"> </w:t>
-      </w:r>
-      <w:proofErr w:type="spellStart"/>
-      <w:r>
-        <w:t>sự</w:t>
-      </w:r>
-      <w:proofErr w:type="spellEnd"/>
-      <w:r>
-        <w:t xml:space="preserve"> </w:t>
-      </w:r>
-      <w:proofErr w:type="spellStart"/>
-      <w:r>
-        <w:t>sai</w:t>
-      </w:r>
-      <w:proofErr w:type="spellEnd"/>
-      <w:r>
-        <w:t xml:space="preserve"> </w:t>
-      </w:r>
-      <w:proofErr w:type="spellStart"/>
-      <w:r>
-        <w:t>khác</w:t>
-      </w:r>
-      <w:proofErr w:type="spellEnd"/>
-      <w:r>
-        <w:t xml:space="preserve"> </w:t>
-      </w:r>
-      <w:proofErr w:type="spellStart"/>
-      <w:r>
-        <w:t>giữa</w:t>
-      </w:r>
-      <w:proofErr w:type="spellEnd"/>
-      <w:r>
-        <w:t xml:space="preserve"> </w:t>
-      </w:r>
-      <w:proofErr w:type="spellStart"/>
-      <w:r>
-        <w:t>các</w:t>
-      </w:r>
-      <w:proofErr w:type="spellEnd"/>
-      <w:r>
-        <w:t xml:space="preserve"> </w:t>
-      </w:r>
-      <w:proofErr w:type="spellStart"/>
-      <w:r>
-        <w:t>thời</w:t>
-      </w:r>
-      <w:proofErr w:type="spellEnd"/>
-      <w:r>
-        <w:t xml:space="preserve"> </w:t>
-      </w:r>
-      <w:proofErr w:type="spellStart"/>
-      <w:r>
-        <w:t>điểm</w:t>
-      </w:r>
-      <w:proofErr w:type="spellEnd"/>
-      <w:r>
-        <w:t xml:space="preserve"> </w:t>
-      </w:r>
-      <w:proofErr w:type="spellStart"/>
-      <w:r>
-        <w:t>truy</w:t>
-      </w:r>
-      <w:proofErr w:type="spellEnd"/>
-      <w:r>
-        <w:t xml:space="preserve"> </w:t>
-      </w:r>
-      <w:proofErr w:type="spellStart"/>
-      <w:r>
-        <w:t>cập</w:t>
-      </w:r>
-      <w:proofErr w:type="spellEnd"/>
-      <w:r>
-        <w:t>.</w:t>
+      <w:r>
+        <w:t>Là sự không đồng bộ của các dữ liệu được git quản lý và lưu trữ. Các dữ liệu của 1 file, thư mục,..có sự sai khác giữa các thời điểm truy cập.</w:t>
       </w:r>
     </w:p>
     <w:p>
@@ -309,47 +35,7 @@
         </w:numPr>
       </w:pPr>
       <w:r>
-        <w:t xml:space="preserve">Trường </w:t>
-      </w:r>
-      <w:proofErr w:type="spellStart"/>
-      <w:r>
-        <w:t>hợp</w:t>
-      </w:r>
-      <w:proofErr w:type="spellEnd"/>
-      <w:r>
-        <w:t xml:space="preserve"> </w:t>
-      </w:r>
-      <w:proofErr w:type="spellStart"/>
-      <w:r>
-        <w:t>gây</w:t>
-      </w:r>
-      <w:proofErr w:type="spellEnd"/>
-      <w:r>
-        <w:t xml:space="preserve"> </w:t>
-      </w:r>
-      <w:proofErr w:type="spellStart"/>
-      <w:r>
-        <w:t>ra</w:t>
-      </w:r>
-      <w:proofErr w:type="spellEnd"/>
-      <w:r>
-        <w:t xml:space="preserve"> </w:t>
-      </w:r>
-      <w:proofErr w:type="spellStart"/>
-      <w:r>
-        <w:t>xung</w:t>
-      </w:r>
-      <w:proofErr w:type="spellEnd"/>
-      <w:r>
-        <w:t xml:space="preserve"> </w:t>
-      </w:r>
-      <w:proofErr w:type="spellStart"/>
-      <w:r>
-        <w:t>đột</w:t>
-      </w:r>
-      <w:proofErr w:type="spellEnd"/>
-      <w:r>
-        <w:t>:</w:t>
+        <w:t>Trường hợp gây ra xung đột:</w:t>
       </w:r>
     </w:p>
     <w:p>
@@ -360,69 +46,8 @@
           <w:numId w:val="2"/>
         </w:numPr>
       </w:pPr>
-      <w:proofErr w:type="spellStart"/>
-      <w:r>
-        <w:t>Nhiều</w:t>
-      </w:r>
-      <w:proofErr w:type="spellEnd"/>
-      <w:r>
-        <w:t xml:space="preserve"> </w:t>
-      </w:r>
-      <w:proofErr w:type="spellStart"/>
-      <w:r>
-        <w:t>người</w:t>
-      </w:r>
-      <w:proofErr w:type="spellEnd"/>
-      <w:r>
-        <w:t xml:space="preserve"> </w:t>
-      </w:r>
-      <w:proofErr w:type="spellStart"/>
-      <w:r>
-        <w:t>cùng</w:t>
-      </w:r>
-      <w:proofErr w:type="spellEnd"/>
-      <w:r>
-        <w:t xml:space="preserve"> </w:t>
-      </w:r>
-      <w:proofErr w:type="spellStart"/>
-      <w:r>
-        <w:t>chỉnh</w:t>
-      </w:r>
-      <w:proofErr w:type="spellEnd"/>
-      <w:r>
-        <w:t xml:space="preserve"> </w:t>
-      </w:r>
-      <w:proofErr w:type="spellStart"/>
-      <w:r>
-        <w:t>sửa</w:t>
-      </w:r>
-      <w:proofErr w:type="spellEnd"/>
-      <w:r>
-        <w:t xml:space="preserve"> </w:t>
-      </w:r>
-      <w:proofErr w:type="spellStart"/>
-      <w:r>
-        <w:t>dữ</w:t>
-      </w:r>
-      <w:proofErr w:type="spellEnd"/>
-      <w:r>
-        <w:t xml:space="preserve"> </w:t>
-      </w:r>
-      <w:proofErr w:type="spellStart"/>
-      <w:r>
-        <w:t>liệu</w:t>
-      </w:r>
-      <w:proofErr w:type="spellEnd"/>
-      <w:r>
-        <w:t xml:space="preserve"> </w:t>
-      </w:r>
-      <w:proofErr w:type="spellStart"/>
-      <w:r>
-        <w:t>trên</w:t>
-      </w:r>
-      <w:proofErr w:type="spellEnd"/>
-      <w:r>
-        <w:t xml:space="preserve"> 1 file.</w:t>
+      <w:r>
+        <w:t>Nhiều người cùng chỉnh sửa dữ liệu trên 1 file.</w:t>
       </w:r>
     </w:p>
     <w:p>
@@ -433,69 +58,8 @@
           <w:numId w:val="2"/>
         </w:numPr>
       </w:pPr>
-      <w:proofErr w:type="spellStart"/>
-      <w:r>
-        <w:t>Gộp</w:t>
-      </w:r>
-      <w:proofErr w:type="spellEnd"/>
-      <w:r>
-        <w:t xml:space="preserve"> </w:t>
-      </w:r>
-      <w:proofErr w:type="spellStart"/>
-      <w:r>
-        <w:t>các</w:t>
-      </w:r>
-      <w:proofErr w:type="spellEnd"/>
-      <w:r>
-        <w:t xml:space="preserve"> </w:t>
-      </w:r>
-      <w:proofErr w:type="spellStart"/>
-      <w:r>
-        <w:t>nhánh</w:t>
-      </w:r>
-      <w:proofErr w:type="spellEnd"/>
-      <w:r>
-        <w:t xml:space="preserve"> </w:t>
-      </w:r>
-      <w:proofErr w:type="spellStart"/>
-      <w:r>
-        <w:t>làm</w:t>
-      </w:r>
-      <w:proofErr w:type="spellEnd"/>
-      <w:r>
-        <w:t xml:space="preserve"> </w:t>
-      </w:r>
-      <w:proofErr w:type="spellStart"/>
-      <w:r>
-        <w:t>việc</w:t>
-      </w:r>
-      <w:proofErr w:type="spellEnd"/>
-      <w:r>
-        <w:t xml:space="preserve"> </w:t>
-      </w:r>
-      <w:proofErr w:type="spellStart"/>
-      <w:r>
-        <w:t>lại</w:t>
-      </w:r>
-      <w:proofErr w:type="spellEnd"/>
-      <w:r>
-        <w:t xml:space="preserve"> </w:t>
-      </w:r>
-      <w:proofErr w:type="spellStart"/>
-      <w:r>
-        <w:t>với</w:t>
-      </w:r>
-      <w:proofErr w:type="spellEnd"/>
-      <w:r>
-        <w:t xml:space="preserve"> </w:t>
-      </w:r>
-      <w:proofErr w:type="spellStart"/>
-      <w:r>
-        <w:t>nhau</w:t>
-      </w:r>
-      <w:proofErr w:type="spellEnd"/>
-      <w:r>
-        <w:t>.</w:t>
+      <w:r>
+        <w:t>Gộp các nhánh làm việc lại với nhau.</w:t>
       </w:r>
     </w:p>
     <w:p>
@@ -506,61 +70,8 @@
           <w:numId w:val="2"/>
         </w:numPr>
       </w:pPr>
-      <w:proofErr w:type="spellStart"/>
-      <w:r>
-        <w:t>Phiên</w:t>
-      </w:r>
-      <w:proofErr w:type="spellEnd"/>
-      <w:r>
-        <w:t xml:space="preserve"> </w:t>
-      </w:r>
-      <w:proofErr w:type="spellStart"/>
-      <w:r>
-        <w:t>bản</w:t>
-      </w:r>
-      <w:proofErr w:type="spellEnd"/>
-      <w:r>
-        <w:t xml:space="preserve"> code </w:t>
-      </w:r>
-      <w:proofErr w:type="spellStart"/>
-      <w:r>
-        <w:t>trên</w:t>
-      </w:r>
-      <w:proofErr w:type="spellEnd"/>
-      <w:r>
-        <w:t xml:space="preserve"> local repository </w:t>
-      </w:r>
-      <w:proofErr w:type="spellStart"/>
-      <w:r>
-        <w:t>không</w:t>
-      </w:r>
-      <w:proofErr w:type="spellEnd"/>
-      <w:r>
-        <w:t xml:space="preserve"> </w:t>
-      </w:r>
-      <w:proofErr w:type="spellStart"/>
-      <w:r>
-        <w:t>đồng</w:t>
-      </w:r>
-      <w:proofErr w:type="spellEnd"/>
-      <w:r>
-        <w:t xml:space="preserve"> </w:t>
-      </w:r>
-      <w:proofErr w:type="spellStart"/>
-      <w:r>
-        <w:t>bộ</w:t>
-      </w:r>
-      <w:proofErr w:type="spellEnd"/>
-      <w:r>
-        <w:t xml:space="preserve"> </w:t>
-      </w:r>
-      <w:proofErr w:type="spellStart"/>
-      <w:r>
-        <w:t>với</w:t>
-      </w:r>
-      <w:proofErr w:type="spellEnd"/>
-      <w:r>
-        <w:t xml:space="preserve"> remote repository.</w:t>
+      <w:r>
+        <w:t>Phiên bản code trên local repository không đồng bộ với remote repository.</w:t>
       </w:r>
     </w:p>
     <w:p>
@@ -583,21 +94,8 @@
           <w:numId w:val="1"/>
         </w:numPr>
       </w:pPr>
-      <w:proofErr w:type="spellStart"/>
-      <w:r>
-        <w:t>Ví</w:t>
-      </w:r>
-      <w:proofErr w:type="spellEnd"/>
-      <w:r>
-        <w:t xml:space="preserve"> </w:t>
-      </w:r>
-      <w:proofErr w:type="spellStart"/>
-      <w:r>
-        <w:t>dụ</w:t>
-      </w:r>
-      <w:proofErr w:type="spellEnd"/>
-      <w:r>
-        <w:t>:</w:t>
+      <w:r>
+        <w:t>Ví dụ:</w:t>
       </w:r>
     </w:p>
     <w:p>
@@ -609,155 +107,92 @@
         </w:numPr>
       </w:pPr>
       <w:r>
-        <w:t xml:space="preserve">Thành </w:t>
-      </w:r>
-      <w:proofErr w:type="spellStart"/>
-      <w:r>
-        <w:t>viên</w:t>
-      </w:r>
-      <w:proofErr w:type="spellEnd"/>
-      <w:r>
-        <w:t xml:space="preserve"> A </w:t>
-      </w:r>
-      <w:proofErr w:type="spellStart"/>
-      <w:r>
-        <w:t>thêm</w:t>
-      </w:r>
-      <w:proofErr w:type="spellEnd"/>
+        <w:t>Thành viên A thêm dòng lệnh console.log”tui tên A” vào file index.html nhưng thành viên B lại sửa thành console.log”tui là B không phải A”</w:t>
+      </w:r>
+      <w:r>
+        <w:t>.</w:t>
+      </w:r>
+    </w:p>
+    <w:p>
+      <w:pPr>
+        <w:pStyle w:val="ListParagraph"/>
+        <w:numPr>
+          <w:ilvl w:val="0"/>
+          <w:numId w:val="1"/>
+        </w:numPr>
+      </w:pPr>
+      <w:r>
+        <w:t xml:space="preserve">Hướng dẫn chạy 2 file “chanLe.cpp” và </w:t>
+      </w:r>
+      <w:r>
+        <w:t>“chanLe.</w:t>
+      </w:r>
+      <w:r>
+        <w:t>sh</w:t>
+      </w:r>
+      <w:r>
+        <w:t>”</w:t>
+      </w:r>
+      <w:r>
+        <w:t>:</w:t>
+      </w:r>
+    </w:p>
+    <w:p>
+      <w:pPr>
+        <w:pStyle w:val="ListParagraph"/>
+        <w:numPr>
+          <w:ilvl w:val="0"/>
+          <w:numId w:val="3"/>
+        </w:numPr>
+        <w:ind w:left="1080"/>
+      </w:pPr>
+      <w:r>
+        <w:t>“chanLe.</w:t>
+      </w:r>
+      <w:r>
+        <w:t>sh</w:t>
+      </w:r>
+      <w:r>
+        <w:t>”</w:t>
+      </w:r>
+      <w:r>
+        <w:t>:</w:t>
+      </w:r>
       <w:r>
         <w:t xml:space="preserve"> </w:t>
       </w:r>
-      <w:proofErr w:type="spellStart"/>
-      <w:r>
-        <w:t>dòng</w:t>
-      </w:r>
-      <w:proofErr w:type="spellEnd"/>
-      <w:r>
-        <w:t xml:space="preserve"> </w:t>
-      </w:r>
-      <w:proofErr w:type="spellStart"/>
-      <w:r>
-        <w:t>lệnh</w:t>
-      </w:r>
-      <w:proofErr w:type="spellEnd"/>
-      <w:r>
-        <w:t xml:space="preserve"> </w:t>
-      </w:r>
-      <w:proofErr w:type="spellStart"/>
-      <w:r>
-        <w:t>console.log”tui</w:t>
-      </w:r>
-      <w:proofErr w:type="spellEnd"/>
-      <w:r>
-        <w:t xml:space="preserve"> </w:t>
-      </w:r>
-      <w:proofErr w:type="spellStart"/>
-      <w:r>
-        <w:t>tên</w:t>
-      </w:r>
-      <w:proofErr w:type="spellEnd"/>
-      <w:r>
-        <w:t xml:space="preserve"> A” </w:t>
-      </w:r>
-      <w:proofErr w:type="spellStart"/>
-      <w:r>
-        <w:t>vào</w:t>
-      </w:r>
-      <w:proofErr w:type="spellEnd"/>
-      <w:r>
-        <w:t xml:space="preserve"> file index.html </w:t>
-      </w:r>
-      <w:proofErr w:type="spellStart"/>
-      <w:r>
-        <w:t>nhưng</w:t>
-      </w:r>
-      <w:proofErr w:type="spellEnd"/>
-      <w:r>
-        <w:t xml:space="preserve"> </w:t>
-      </w:r>
-      <w:proofErr w:type="spellStart"/>
-      <w:r>
-        <w:t>thành</w:t>
-      </w:r>
-      <w:proofErr w:type="spellEnd"/>
-      <w:r>
-        <w:t xml:space="preserve"> </w:t>
-      </w:r>
-      <w:proofErr w:type="spellStart"/>
-      <w:r>
-        <w:t>viên</w:t>
-      </w:r>
-      <w:proofErr w:type="spellEnd"/>
-      <w:r>
-        <w:t xml:space="preserve"> B </w:t>
-      </w:r>
-      <w:proofErr w:type="spellStart"/>
-      <w:r>
-        <w:t>lại</w:t>
-      </w:r>
-      <w:proofErr w:type="spellEnd"/>
-      <w:r>
-        <w:t xml:space="preserve"> </w:t>
-      </w:r>
-      <w:proofErr w:type="spellStart"/>
-      <w:r>
-        <w:t>sửa</w:t>
-      </w:r>
-      <w:proofErr w:type="spellEnd"/>
-      <w:r>
-        <w:t xml:space="preserve"> </w:t>
-      </w:r>
-      <w:proofErr w:type="spellStart"/>
-      <w:r>
-        <w:t>thành</w:t>
-      </w:r>
-      <w:proofErr w:type="spellEnd"/>
-      <w:r>
-        <w:t xml:space="preserve"> </w:t>
-      </w:r>
-      <w:proofErr w:type="spellStart"/>
-      <w:r>
-        <w:t>console.log</w:t>
-      </w:r>
-      <w:r>
-        <w:t>”tui</w:t>
-      </w:r>
-      <w:proofErr w:type="spellEnd"/>
-      <w:r>
-        <w:t xml:space="preserve"> </w:t>
-      </w:r>
-      <w:proofErr w:type="spellStart"/>
-      <w:r>
-        <w:t>là</w:t>
-      </w:r>
-      <w:proofErr w:type="spellEnd"/>
-      <w:r>
-        <w:t xml:space="preserve"> </w:t>
-      </w:r>
-      <w:r>
-        <w:t xml:space="preserve">B </w:t>
-      </w:r>
-      <w:proofErr w:type="spellStart"/>
-      <w:r>
-        <w:t>không</w:t>
-      </w:r>
-      <w:proofErr w:type="spellEnd"/>
-      <w:r>
-        <w:t xml:space="preserve"> </w:t>
-      </w:r>
-      <w:proofErr w:type="spellStart"/>
-      <w:r>
-        <w:t>phải</w:t>
-      </w:r>
-      <w:proofErr w:type="spellEnd"/>
-      <w:r>
-        <w:t xml:space="preserve"> A</w:t>
-      </w:r>
-      <w:r>
-        <w:t>”</w:t>
-      </w:r>
-      <w:r>
-        <w:t>.</w:t>
+    </w:p>
+    <w:p>
+      <w:pPr>
+        <w:pStyle w:val="ListParagraph"/>
+        <w:ind w:left="1080"/>
+        <w:rPr>
+          <w:b/>
+          <w:bCs/>
+        </w:rPr>
+      </w:pPr>
+      <w:r>
+        <w:rPr>
+          <w:b/>
+          <w:bCs/>
+        </w:rPr>
+        <w:t>Mở git bash và chạy lệnh:  ./chanLe.sh</w:t>
+      </w:r>
+    </w:p>
+    <w:p>
+      <w:pPr>
+        <w:pStyle w:val="ListParagraph"/>
+        <w:numPr>
+          <w:ilvl w:val="0"/>
+          <w:numId w:val="3"/>
+        </w:numPr>
+        <w:ind w:left="1080"/>
+      </w:pPr>
+      <w:r>
+        <w:t>“chanLe.cpp”</w:t>
+      </w:r>
+      <w:r>
+        <w:t>:</w:t>
       </w:r>
     </w:p>
     <w:sectPr>
@@ -877,7 +312,7 @@
         <w:rFonts w:ascii="Calibri" w:eastAsiaTheme="minorHAnsi" w:hAnsi="Calibri" w:cs="Calibri" w:hint="default"/>
       </w:rPr>
     </w:lvl>
-    <w:lvl w:ilvl="1" w:tplc="04090003" w:tentative="1">
+    <w:lvl w:ilvl="1" w:tplc="04090003">
       <w:start w:val="1"/>
       <w:numFmt w:val="bullet"/>
       <w:lvlText w:val="o"/>
@@ -972,6 +407,95 @@
       <w:rPr>
         <w:rFonts w:ascii="Wingdings" w:hAnsi="Wingdings" w:hint="default"/>
       </w:rPr>
+    </w:lvl>
+  </w:abstractNum>
+  <w:abstractNum w:abstractNumId="2" w15:restartNumberingAfterBreak="0">
+    <w:nsid w:val="42A20C55"/>
+    <w:multiLevelType w:val="hybridMultilevel"/>
+    <w:tmpl w:val="89760B92"/>
+    <w:lvl w:ilvl="0" w:tplc="04090019">
+      <w:start w:val="1"/>
+      <w:numFmt w:val="lowerLetter"/>
+      <w:lvlText w:val="%1."/>
+      <w:lvlJc w:val="left"/>
+      <w:pPr>
+        <w:ind w:left="720" w:hanging="360"/>
+      </w:pPr>
+      <w:rPr>
+        <w:rFonts w:hint="default"/>
+      </w:rPr>
+    </w:lvl>
+    <w:lvl w:ilvl="1" w:tplc="04090019" w:tentative="1">
+      <w:start w:val="1"/>
+      <w:numFmt w:val="lowerLetter"/>
+      <w:lvlText w:val="%2."/>
+      <w:lvlJc w:val="left"/>
+      <w:pPr>
+        <w:ind w:left="1440" w:hanging="360"/>
+      </w:pPr>
+    </w:lvl>
+    <w:lvl w:ilvl="2" w:tplc="0409001B" w:tentative="1">
+      <w:start w:val="1"/>
+      <w:numFmt w:val="lowerRoman"/>
+      <w:lvlText w:val="%3."/>
+      <w:lvlJc w:val="right"/>
+      <w:pPr>
+        <w:ind w:left="2160" w:hanging="180"/>
+      </w:pPr>
+    </w:lvl>
+    <w:lvl w:ilvl="3" w:tplc="0409000F" w:tentative="1">
+      <w:start w:val="1"/>
+      <w:numFmt w:val="decimal"/>
+      <w:lvlText w:val="%4."/>
+      <w:lvlJc w:val="left"/>
+      <w:pPr>
+        <w:ind w:left="2880" w:hanging="360"/>
+      </w:pPr>
+    </w:lvl>
+    <w:lvl w:ilvl="4" w:tplc="04090019" w:tentative="1">
+      <w:start w:val="1"/>
+      <w:numFmt w:val="lowerLetter"/>
+      <w:lvlText w:val="%5."/>
+      <w:lvlJc w:val="left"/>
+      <w:pPr>
+        <w:ind w:left="3600" w:hanging="360"/>
+      </w:pPr>
+    </w:lvl>
+    <w:lvl w:ilvl="5" w:tplc="0409001B" w:tentative="1">
+      <w:start w:val="1"/>
+      <w:numFmt w:val="lowerRoman"/>
+      <w:lvlText w:val="%6."/>
+      <w:lvlJc w:val="right"/>
+      <w:pPr>
+        <w:ind w:left="4320" w:hanging="180"/>
+      </w:pPr>
+    </w:lvl>
+    <w:lvl w:ilvl="6" w:tplc="0409000F" w:tentative="1">
+      <w:start w:val="1"/>
+      <w:numFmt w:val="decimal"/>
+      <w:lvlText w:val="%7."/>
+      <w:lvlJc w:val="left"/>
+      <w:pPr>
+        <w:ind w:left="5040" w:hanging="360"/>
+      </w:pPr>
+    </w:lvl>
+    <w:lvl w:ilvl="7" w:tplc="04090019" w:tentative="1">
+      <w:start w:val="1"/>
+      <w:numFmt w:val="lowerLetter"/>
+      <w:lvlText w:val="%8."/>
+      <w:lvlJc w:val="left"/>
+      <w:pPr>
+        <w:ind w:left="5760" w:hanging="360"/>
+      </w:pPr>
+    </w:lvl>
+    <w:lvl w:ilvl="8" w:tplc="0409001B" w:tentative="1">
+      <w:start w:val="1"/>
+      <w:numFmt w:val="lowerRoman"/>
+      <w:lvlText w:val="%9."/>
+      <w:lvlJc w:val="right"/>
+      <w:pPr>
+        <w:ind w:left="6480" w:hanging="180"/>
+      </w:pPr>
     </w:lvl>
   </w:abstractNum>
   <w:num w:numId="1" w16cid:durableId="68159592">
@@ -979,6 +503,9 @@
   </w:num>
   <w:num w:numId="2" w16cid:durableId="1699962957">
     <w:abstractNumId w:val="1"/>
+  </w:num>
+  <w:num w:numId="3" w16cid:durableId="1222713844">
+    <w:abstractNumId w:val="2"/>
   </w:num>
 </w:numbering>
 </file>

</xml_diff>